<commit_message>
Add Add GB conversion
</commit_message>
<xml_diff>
--- a/New.docx
+++ b/New.docx
@@ -5,6 +5,15 @@
     <w:p>
       <w:r>
         <w:t>How are you bro!</w:t>
+      </w:r>
+      <w:r>
+        <w:t xml:space="preserve">    </w:t>
+      </w:r>
+    </w:p>
+    <w:p/>
+    <w:p>
+      <w:r>
+        <w:t>Then  to dmndfndf,d.dmfmd;d,;fd;f,df</w:t>
       </w:r>
     </w:p>
     <w:sectPr>

</xml_diff>